<commit_message>
Update project status report
</commit_message>
<xml_diff>
--- a/docs/PonniRAG — Project Status Report.docx
+++ b/docs/PonniRAG — Project Status Report.docx
@@ -2,72 +2,80 @@
 <file path=word/document.xml><?xml version="1.0" encoding="utf-8"?>
 <w:document xmlns:mc="http://schemas.openxmlformats.org/markup-compatibility/2006" xmlns:o="urn:schemas-microsoft-com:office:office" xmlns:r="http://schemas.openxmlformats.org/officeDocument/2006/relationships" xmlns:m="http://schemas.openxmlformats.org/officeDocument/2006/math" xmlns:v="urn:schemas-microsoft-com:vml" xmlns:wp="http://schemas.openxmlformats.org/drawingml/2006/wordprocessingDrawing" xmlns:w10="urn:schemas-microsoft-com:office:word" xmlns:w="http://schemas.openxmlformats.org/wordprocessingml/2006/main" xmlns:wne="http://schemas.microsoft.com/office/word/2006/wordml" xmlns:sl="http://schemas.openxmlformats.org/schemaLibrary/2006/main" xmlns:a="http://schemas.openxmlformats.org/drawingml/2006/main" xmlns:pic="http://schemas.openxmlformats.org/drawingml/2006/picture" xmlns:c="http://schemas.openxmlformats.org/drawingml/2006/chart" xmlns:lc="http://schemas.openxmlformats.org/drawingml/2006/lockedCanvas" xmlns:dgm="http://schemas.openxmlformats.org/drawingml/2006/diagram" xmlns:wps="http://schemas.microsoft.com/office/word/2010/wordprocessingShape" xmlns:wpg="http://schemas.microsoft.com/office/word/2010/wordprocessingGroup" xmlns:w14="http://schemas.microsoft.com/office/word/2010/wordml" xmlns:w15="http://schemas.microsoft.com/office/word/2012/wordml" xmlns:w16="http://schemas.microsoft.com/office/word/2018/wordml" xmlns:w16cex="http://schemas.microsoft.com/office/word/2018/wordml/cex" xmlns:w16cid="http://schemas.microsoft.com/office/word/2016/wordml/cid" xmlns="http://schemas.microsoft.com/office/tasks/2019/documenttasks" xmlns:cr="http://schemas.microsoft.com/office/comments/2020/reactions">
   <w:body>
-    <w:p>
-      <w:pPr>
-        <w:pStyle w:val="Title"/>
-        <w:keepNext w:val="0"/>
-        <w:keepLines w:val="0"/>
-        <w:pageBreakBefore w:val="0"/>
-        <w:widowControl w:val="0"/>
-        <w:pBdr>
-          <w:top w:space="0" w:sz="0" w:val="nil"/>
-          <w:left w:space="0" w:sz="0" w:val="nil"/>
-          <w:bottom w:space="0" w:sz="0" w:val="nil"/>
-          <w:right w:space="0" w:sz="0" w:val="nil"/>
-          <w:between w:space="0" w:sz="0" w:val="nil"/>
-        </w:pBdr>
-        <w:shd w:fill="auto" w:val="clear"/>
-        <w:spacing w:after="0" w:before="0" w:line="276" w:lineRule="auto"/>
-        <w:ind w:left="0" w:right="0" w:firstLine="0"/>
-        <w:jc w:val="left"/>
-        <w:rPr>
-          <w:rFonts w:ascii="Arial" w:cs="Arial" w:eastAsia="Arial" w:hAnsi="Arial"/>
-          <w:b w:val="0"/>
-          <w:bCs w:val="0"/>
-          <w:i w:val="0"/>
-          <w:iCs w:val="0"/>
-          <w:smallCaps w:val="0"/>
-          <w:strike w:val="0"/>
-          <w:color w:val="000000"/>
-          <w:sz w:val="22"/>
-          <w:szCs w:val="22"/>
-          <w:u w:val="none"/>
-          <w:shd w:fill="auto" w:val="clear"/>
-          <w:vertAlign w:val="baseline"/>
-        </w:rPr>
-        <w:sectPr>
-          <w:pgSz w:h="16834" w:w="11909" w:orient="portrait"/>
-          <w:pgMar w:bottom="1440" w:top="1440" w:left="1440" w:right="1440" w:header="720" w:footer="720"/>
-          <w:pgNumType w:start="1"/>
-        </w:sectPr>
-      </w:pPr>
-      <w:bookmarkStart w:colFirst="0" w:colLast="0" w:name="_9wkd3x5x1f6b" w:id="0"/>
-      <w:bookmarkEnd w:id="0"/>
-      <w:r>
-        <w:rPr>
-          <w:rFonts w:ascii="Arial" w:cs="Arial" w:eastAsia="Arial" w:hAnsi="Arial"/>
-          <w:b w:val="0"/>
-          <w:bCs w:val="0"/>
-          <w:i w:val="0"/>
-          <w:iCs w:val="0"/>
-          <w:smallCaps w:val="0"/>
-          <w:strike w:val="0"/>
-          <w:color w:val="000000"/>
-          <w:sz w:val="52"/>
-          <w:szCs w:val="52"/>
-          <w:u w:val="none"/>
-          <w:shd w:fill="auto" w:val="clear"/>
-          <w:vertAlign w:val="baseline"/>
-          <w:rtl w:val="0"/>
-        </w:rPr>
-        <w:t xml:space="preserve">PonniRAG — Project Status Report</w:t>
-      </w:r>
-      <w:r>
-        <w:rPr>
-          <w:rtl w:val="0"/>
-        </w:rPr>
-      </w:r>
-    </w:p>
+    <w:sdt>
+      <w:sdtPr>
+        <w:id w:val="1213415708"/>
+        <w:tag w:val="goog_rdk_0"/>
+      </w:sdtPr>
+      <w:sdtContent>
+        <w:p>
+          <w:pPr>
+            <w:pStyle w:val="Title"/>
+            <w:keepNext w:val="0"/>
+            <w:keepLines w:val="0"/>
+            <w:pageBreakBefore w:val="0"/>
+            <w:widowControl w:val="0"/>
+            <w:pBdr>
+              <w:top w:space="0" w:sz="0" w:val="nil"/>
+              <w:left w:space="0" w:sz="0" w:val="nil"/>
+              <w:bottom w:space="0" w:sz="0" w:val="nil"/>
+              <w:right w:space="0" w:sz="0" w:val="nil"/>
+              <w:between w:space="0" w:sz="0" w:val="nil"/>
+            </w:pBdr>
+            <w:shd w:fill="auto" w:val="clear"/>
+            <w:spacing w:after="0" w:before="0" w:line="276" w:lineRule="auto"/>
+            <w:ind w:left="0" w:right="0" w:firstLine="0"/>
+            <w:jc w:val="left"/>
+            <w:rPr>
+              <w:rFonts w:ascii="Arial" w:cs="Arial" w:eastAsia="Arial" w:hAnsi="Arial"/>
+              <w:b w:val="0"/>
+              <w:bCs w:val="0"/>
+              <w:i w:val="0"/>
+              <w:iCs w:val="0"/>
+              <w:smallCaps w:val="0"/>
+              <w:strike w:val="0"/>
+              <w:color w:val="000000"/>
+              <w:sz w:val="22"/>
+              <w:szCs w:val="22"/>
+              <w:u w:val="none"/>
+              <w:shd w:fill="auto" w:val="clear"/>
+              <w:vertAlign w:val="baseline"/>
+            </w:rPr>
+            <w:sectPr>
+              <w:pgSz w:h="16834" w:w="11909" w:orient="portrait"/>
+              <w:pgMar w:bottom="1440" w:top="1440" w:left="1440" w:right="1440" w:header="720" w:footer="720"/>
+              <w:pgNumType w:start="1"/>
+            </w:sectPr>
+          </w:pPr>
+          <w:bookmarkStart w:colFirst="0" w:colLast="0" w:name="_heading=h.7vu3ttg2hsho" w:id="0"/>
+          <w:bookmarkEnd w:id="0"/>
+          <w:r>
+            <w:rPr>
+              <w:rFonts w:ascii="Arial" w:cs="Arial" w:eastAsia="Arial" w:hAnsi="Arial"/>
+              <w:b w:val="0"/>
+              <w:bCs w:val="0"/>
+              <w:i w:val="0"/>
+              <w:iCs w:val="0"/>
+              <w:smallCaps w:val="0"/>
+              <w:strike w:val="0"/>
+              <w:color w:val="000000"/>
+              <w:sz w:val="52"/>
+              <w:szCs w:val="52"/>
+              <w:u w:val="none"/>
+              <w:shd w:fill="auto" w:val="clear"/>
+              <w:vertAlign w:val="baseline"/>
+              <w:rtl w:val="0"/>
+            </w:rPr>
+            <w:t xml:space="preserve">PonniRAG — Project Status Report</w:t>
+          </w:r>
+          <w:r>
+            <w:rPr>
+              <w:rtl w:val="0"/>
+            </w:rPr>
+          </w:r>
+        </w:p>
+      </w:sdtContent>
+    </w:sdt>
     <w:p>
       <w:pPr>
         <w:pStyle w:val="Title"/>
@@ -106,57 +114,7 @@
         <w:rPr/>
       </w:pPr>
       <w:r>
-        <w:rPr>
-          <w:b w:val="1"/>
-          <w:bCs w:val="1"/>
-          <w:color w:val="666666"/>
-          <w:rtl w:val="0"/>
-        </w:rPr>
-        <w:t xml:space="preserve">Project: </w:t>
-      </w:r>
-      <w:r>
-        <w:rPr>
-          <w:color w:val="1a1a2e"/>
-          <w:rtl w:val="0"/>
-        </w:rPr>
-        <w:t xml:space="preserve">AI-Enabled Search for Ponni Archives</w:t>
-      </w:r>
-      <w:r>
-        <w:rPr>
-          <w:b w:val="1"/>
-          <w:bCs w:val="1"/>
-          <w:color w:val="666666"/>
-          <w:rtl w:val="0"/>
-        </w:rPr>
-        <w:t xml:space="preserve">  |  Date: </w:t>
-      </w:r>
-      <w:r>
-        <w:rPr>
-          <w:color w:val="1a1a2e"/>
-          <w:rtl w:val="0"/>
-        </w:rPr>
-        <w:t xml:space="preserve">19 Feb 2026</w:t>
-      </w:r>
-      <w:r>
-        <w:rPr>
-          <w:b w:val="1"/>
-          <w:bCs w:val="1"/>
-          <w:color w:val="666666"/>
-          <w:rtl w:val="0"/>
-        </w:rPr>
-        <w:t xml:space="preserve">  |  Status: </w:t>
-      </w:r>
-      <w:r>
-        <w:rPr>
-          <w:color w:val="1a1a2e"/>
-          <w:rtl w:val="0"/>
-        </w:rPr>
-        <w:t xml:space="preserve">Active Development</w:t>
-      </w:r>
-      <w:r>
-        <w:rPr>
-          <w:rtl w:val="0"/>
-        </w:rPr>
+        <w:t>Project: AI-Enabled Search for Ponni Archives  |  Date: 24 Mar 2026  |  Status: Active Development</w:t>
       </w:r>
     </w:p>
     <w:p>
@@ -166,57 +124,7 @@
         <w:rPr/>
       </w:pPr>
       <w:r>
-        <w:rPr>
-          <w:b w:val="1"/>
-          <w:bCs w:val="1"/>
-          <w:color w:val="666666"/>
-          <w:rtl w:val="0"/>
-        </w:rPr>
-        <w:t xml:space="preserve">Client: </w:t>
-      </w:r>
-      <w:r>
-        <w:rPr>
-          <w:color w:val="1a1a2e"/>
-          <w:rtl w:val="0"/>
-        </w:rPr>
-        <w:t xml:space="preserve">DCKAP</w:t>
-      </w:r>
-      <w:r>
-        <w:rPr>
-          <w:b w:val="1"/>
-          <w:bCs w:val="1"/>
-          <w:color w:val="666666"/>
-          <w:rtl w:val="0"/>
-        </w:rPr>
-        <w:t xml:space="preserve">  |  Company: </w:t>
-      </w:r>
-      <w:r>
-        <w:rPr>
-          <w:color w:val="1a1a2e"/>
-          <w:rtl w:val="0"/>
-        </w:rPr>
-        <w:t xml:space="preserve">Nunnari Labs</w:t>
-      </w:r>
-      <w:r>
-        <w:rPr>
-          <w:b w:val="1"/>
-          <w:bCs w:val="1"/>
-          <w:color w:val="666666"/>
-          <w:rtl w:val="0"/>
-        </w:rPr>
-        <w:t xml:space="preserve">  |  Data: </w:t>
-      </w:r>
-      <w:r>
-        <w:rPr>
-          <w:color w:val="1a1a2e"/>
-          <w:rtl w:val="0"/>
-        </w:rPr>
-        <w:t xml:space="preserve">5/8 volumes indexed (3 volumes awaiting OCR data)</w:t>
-      </w:r>
-      <w:r>
-        <w:rPr>
-          <w:rtl w:val="0"/>
-        </w:rPr>
+        <w:t>Client: DCKAP  |  Company: Nunnari Labs  |  Data: 5/8 volumes indexed (1,259 articles from 73 issues)</w:t>
       </w:r>
     </w:p>
     <w:p>
@@ -1104,7 +1012,7 @@
                 <w:color w:val="dd8800"/>
                 <w:rtl w:val="0"/>
               </w:rPr>
-              <w:t xml:space="preserve">Skipped</w:t>
+              <w:t xml:space="preserve">Skipped (is not needed)</w:t>
             </w:r>
             <w:r>
               <w:rPr>
@@ -1646,7 +1554,7 @@
                 <w:color w:val="dd8800"/>
                 <w:rtl w:val="0"/>
               </w:rPr>
-              <w:t xml:space="preserve">Skipped</w:t>
+              <w:t xml:space="preserve">Skipped (is not needed)</w:t>
             </w:r>
             <w:r>
               <w:rPr>
@@ -1684,20 +1592,7 @@
         </w:rPr>
       </w:pPr>
       <w:r>
-        <w:rPr>
-          <w:b w:val="1"/>
-          <w:bCs w:val="1"/>
-          <w:color w:val="1a1a2e"/>
-          <w:sz w:val="22"/>
-          <w:szCs w:val="22"/>
-          <w:rtl w:val="0"/>
-        </w:rPr>
-        <w:t xml:space="preserve">Phase 4: UI Development &amp; Tagging — PARTIAL</w:t>
-      </w:r>
-      <w:r>
-        <w:rPr>
-          <w:rtl w:val="0"/>
-        </w:rPr>
+        <w:t>Phase 4: UI Development &amp; Tagging — COMPLETE</w:t>
       </w:r>
     </w:p>
     <w:tbl>
@@ -1888,6 +1783,44 @@
             <w:shd w:fill="e8f5e9" w:val="clear"/>
           </w:tcPr>
           <w:p>
+            <w:r>
+              <w:t>Done</w:t>
+            </w:r>
+          </w:p>
+        </w:tc>
+        <w:tc>
+          <w:tcPr/>
+          <w:p>
+            <w:r>
+              <w:t>docker-compose.yml — 3 services (Qdrant, FastAPI, React/Nginx). Ollama removed after Gemini migration.</w:t>
+            </w:r>
+          </w:p>
+        </w:tc>
+      </w:tr>
+      <w:tr>
+        <w:trPr>
+          <w:cantSplit w:val="0"/>
+          <w:tblHeader w:val="0"/>
+        </w:trPr>
+        <w:tc>
+          <w:tcPr/>
+          <w:p>
+            <w:pPr>
+              <w:rPr/>
+            </w:pPr>
+            <w:r>
+              <w:rPr>
+                <w:rtl w:val="0"/>
+              </w:rPr>
+              <w:t xml:space="preserve">Request/response logging</w:t>
+            </w:r>
+          </w:p>
+        </w:tc>
+        <w:tc>
+          <w:tcPr>
+            <w:shd w:fill="e8f5e9" w:val="clear"/>
+          </w:tcPr>
+          <w:p>
             <w:pPr>
               <w:rPr/>
             </w:pPr>
@@ -1917,27 +1850,27 @@
               <w:rPr>
                 <w:rtl w:val="0"/>
               </w:rPr>
-              <w:t xml:space="preserve">docker-compose.yml — 4 services (Qdrant, Ollama, API, Frontend) + GPU</w:t>
-            </w:r>
-          </w:p>
-        </w:tc>
-      </w:tr>
-      <w:tr>
-        <w:trPr>
-          <w:cantSplit w:val="0"/>
-          <w:tblHeader w:val="0"/>
-        </w:trPr>
-        <w:tc>
-          <w:tcPr/>
-          <w:p>
-            <w:pPr>
-              <w:rPr/>
-            </w:pPr>
-            <w:r>
-              <w:rPr>
-                <w:rtl w:val="0"/>
-              </w:rPr>
-              <w:t xml:space="preserve">Request/response logging</w:t>
+              <w:t xml:space="preserve">FastAPI interceptors; Ollama health monitoring on startup</w:t>
+            </w:r>
+          </w:p>
+        </w:tc>
+      </w:tr>
+      <w:tr>
+        <w:trPr>
+          <w:cantSplit w:val="0"/>
+          <w:tblHeader w:val="0"/>
+        </w:trPr>
+        <w:tc>
+          <w:tcPr/>
+          <w:p>
+            <w:pPr>
+              <w:rPr/>
+            </w:pPr>
+            <w:r>
+              <w:rPr>
+                <w:rtl w:val="0"/>
+              </w:rPr>
+              <w:t xml:space="preserve">Article categorization &amp; automated tagging</w:t>
             </w:r>
           </w:p>
         </w:tc>
@@ -1946,94 +1879,16 @@
             <w:shd w:fill="e8f5e9" w:val="clear"/>
           </w:tcPr>
           <w:p>
-            <w:pPr>
-              <w:rPr/>
-            </w:pPr>
-            <w:r>
-              <w:rPr>
-                <w:b w:val="1"/>
-                <w:bCs w:val="1"/>
-                <w:color w:val="228b22"/>
-                <w:rtl w:val="0"/>
-              </w:rPr>
-              <w:t xml:space="preserve">Done</w:t>
-            </w:r>
-            <w:r>
-              <w:rPr>
-                <w:rtl w:val="0"/>
-              </w:rPr>
-            </w:r>
-          </w:p>
-        </w:tc>
-        <w:tc>
-          <w:tcPr/>
-          <w:p>
-            <w:pPr>
-              <w:rPr/>
-            </w:pPr>
-            <w:r>
-              <w:rPr>
-                <w:rtl w:val="0"/>
-              </w:rPr>
-              <w:t xml:space="preserve">FastAPI interceptors; Ollama health monitoring on startup</w:t>
-            </w:r>
-          </w:p>
-        </w:tc>
-      </w:tr>
-      <w:tr>
-        <w:trPr>
-          <w:cantSplit w:val="0"/>
-          <w:tblHeader w:val="0"/>
-        </w:trPr>
-        <w:tc>
-          <w:tcPr/>
-          <w:p>
-            <w:pPr>
-              <w:rPr/>
-            </w:pPr>
-            <w:r>
-              <w:rPr>
-                <w:rtl w:val="0"/>
-              </w:rPr>
-              <w:t xml:space="preserve">Article categorization &amp; automated tagging</w:t>
-            </w:r>
-          </w:p>
-        </w:tc>
-        <w:tc>
-          <w:tcPr>
-            <w:shd w:fill="ffebee" w:val="clear"/>
-          </w:tcPr>
-          <w:p>
-            <w:pPr>
-              <w:rPr/>
-            </w:pPr>
-            <w:r>
-              <w:rPr>
-                <w:b w:val="1"/>
-                <w:bCs w:val="1"/>
-                <w:color w:val="cc0000"/>
-                <w:rtl w:val="0"/>
-              </w:rPr>
-              <w:t xml:space="preserve">Not done at the moment but will be implemented before handoff</w:t>
-            </w:r>
-            <w:r>
-              <w:rPr>
-                <w:rtl w:val="0"/>
-              </w:rPr>
-            </w:r>
-          </w:p>
-        </w:tc>
-        <w:tc>
-          <w:tcPr/>
-          <w:p>
-            <w:pPr>
-              <w:rPr/>
-            </w:pPr>
-            <w:r>
-              <w:rPr>
-                <w:rtl w:val="0"/>
-              </w:rPr>
-              <w:t xml:space="preserve">No tagging pipeline or tag taxonomy built</w:t>
+            <w:r>
+              <w:t>Done</w:t>
+            </w:r>
+          </w:p>
+        </w:tc>
+        <w:tc>
+          <w:tcPr/>
+          <w:p>
+            <w:r>
+              <w:t>article_tagger.py — hybrid offline tagger (rule-based patterns + TF-IDF fallback). 15-category taxonomy (Tamil + English labels). 1–3 tags per article. Deterministic, no LLM. update_csv_tags.py syncs tags to summary.csv.</w:t>
             </w:r>
           </w:p>
         </w:tc>
@@ -2059,39 +1914,19 @@
         </w:tc>
         <w:tc>
           <w:tcPr>
-            <w:shd w:fill="ffebee" w:val="clear"/>
-          </w:tcPr>
-          <w:p>
-            <w:pPr>
-              <w:rPr/>
-            </w:pPr>
-            <w:r>
-              <w:rPr>
-                <w:b w:val="1"/>
-                <w:bCs w:val="1"/>
-                <w:color w:val="cc0000"/>
-                <w:rtl w:val="0"/>
-              </w:rPr>
-              <w:t xml:space="preserve">Not done at the moment but will be implemented before handoff</w:t>
-            </w:r>
-            <w:r>
-              <w:rPr>
-                <w:rtl w:val="0"/>
-              </w:rPr>
-            </w:r>
-          </w:p>
-        </w:tc>
-        <w:tc>
-          <w:tcPr/>
-          <w:p>
-            <w:pPr>
-              <w:rPr/>
-            </w:pPr>
-            <w:r>
-              <w:rPr>
-                <w:rtl w:val="0"/>
-              </w:rPr>
-              <w:t xml:space="preserve">No tag UI or tag-based browsing implemented</w:t>
+            <w:shd w:fill="e8f5e9" w:val="clear"/>
+          </w:tcPr>
+          <w:p>
+            <w:r>
+              <w:t>Done</w:t>
+            </w:r>
+          </w:p>
+        </w:tc>
+        <w:tc>
+          <w:tcPr/>
+          <w:p>
+            <w:r>
+              <w:t>React TagBrowse page — browse 15 categories with article counts, drill into article lists. Category filter dropdown + search within issues. API: /api/tags, /api/tags/{id}/articles. Tag badges on source cards in AI Chat.</w:t>
             </w:r>
           </w:p>
         </w:tc>
@@ -2278,14 +2113,8 @@
         <w:tc>
           <w:tcPr/>
           <w:p>
-            <w:pPr>
-              <w:rPr/>
-            </w:pPr>
-            <w:r>
-              <w:rPr>
-                <w:rtl w:val="0"/>
-              </w:rPr>
-              <w:t xml:space="preserve">18 test files — extraction, search, API, evaluation modules</w:t>
+            <w:r>
+              <w:t>26 test files covering extraction, search, API, guardrails, tagging, caching, evaluation, retry, snapshots</w:t>
             </w:r>
           </w:p>
         </w:tc>
@@ -2336,14 +2165,8 @@
         <w:tc>
           <w:tcPr/>
           <w:p>
-            <w:pPr>
-              <w:rPr/>
-            </w:pPr>
-            <w:r>
-              <w:rPr>
-                <w:rtl w:val="0"/>
-              </w:rPr>
-              <w:t xml:space="preserve">Context window optimization, streaming fixes, response quality</w:t>
+            <w:r>
+              <w:t>Quote stripping (422 fix), author display formatting (no brackets, NA fallback), hero title Tamil descender fix, pre-commit hooks enforced (Black, isort, flake8, gitleaks). All 1,064 flake8 violations fixed across 57 files.</w:t>
             </w:r>
           </w:p>
         </w:tc>
@@ -2394,14 +2217,8 @@
         <w:tc>
           <w:tcPr/>
           <w:p>
-            <w:pPr>
-              <w:rPr/>
-            </w:pPr>
-            <w:r>
-              <w:rPr>
-                <w:rtl w:val="0"/>
-              </w:rPr>
-              <w:t xml:space="preserve">Semantic similarity, char-level BLEU/ROUGE-L, BERTScore for Tamil</w:t>
+            <w:r>
+              <w:t>Semantic similarity (50%) + BERTScore-F1 (25%) + ROUGE-L (15%) + BLEU-1 (10%). Character-level tokenization for Tamil. CLI pipeline with Excel/JSON reports.</w:t>
             </w:r>
           </w:p>
         </w:tc>
@@ -2430,36 +2247,16 @@
             <w:shd w:fill="fff3e0" w:val="clear"/>
           </w:tcPr>
           <w:p>
-            <w:pPr>
-              <w:rPr/>
-            </w:pPr>
-            <w:r>
-              <w:rPr>
-                <w:b w:val="1"/>
-                <w:bCs w:val="1"/>
-                <w:color w:val="dd8800"/>
-                <w:rtl w:val="0"/>
-              </w:rPr>
-              <w:t xml:space="preserve">Partial</w:t>
-            </w:r>
-            <w:r>
-              <w:rPr>
-                <w:rtl w:val="0"/>
-              </w:rPr>
-            </w:r>
-          </w:p>
-        </w:tc>
-        <w:tc>
-          <w:tcPr/>
-          <w:p>
-            <w:pPr>
-              <w:rPr/>
-            </w:pPr>
-            <w:r>
-              <w:rPr>
-                <w:rtl w:val="0"/>
-              </w:rPr>
-              <w:t xml:space="preserve">30-question template (7 categories) created; human answers pending</w:t>
+            <w:r>
+              <w:t>Done</w:t>
+            </w:r>
+          </w:p>
+        </w:tc>
+        <w:tc>
+          <w:tcPr/>
+          <w:p>
+            <w:r>
+              <w:t>50-question ground truth dataset (ground_truth_data.csv) + evaluation report (ground_truth_report.xlsx)</w:t>
             </w:r>
           </w:p>
         </w:tc>
@@ -2488,36 +2285,16 @@
             <w:shd w:fill="fff3e0" w:val="clear"/>
           </w:tcPr>
           <w:p>
-            <w:pPr>
-              <w:rPr/>
-            </w:pPr>
-            <w:r>
-              <w:rPr>
-                <w:b w:val="1"/>
-                <w:bCs w:val="1"/>
-                <w:color w:val="dd8800"/>
-                <w:rtl w:val="0"/>
-              </w:rPr>
-              <w:t xml:space="preserve">Pending</w:t>
-            </w:r>
-            <w:r>
-              <w:rPr>
-                <w:rtl w:val="0"/>
-              </w:rPr>
-            </w:r>
-          </w:p>
-        </w:tc>
-        <w:tc>
-          <w:tcPr/>
-          <w:p>
-            <w:pPr>
-              <w:rPr/>
-            </w:pPr>
-            <w:r>
-              <w:rPr>
-                <w:rtl w:val="0"/>
-              </w:rPr>
-              <w:t xml:space="preserve">Awaiting evaluation with students</w:t>
+            <w:r>
+              <w:t>In Progress</w:t>
+            </w:r>
+          </w:p>
+        </w:tc>
+        <w:tc>
+          <w:tcPr/>
+          <w:p>
+            <w:r>
+              <w:t>156 test cases across 8 sections (Chat, Tags UI, Cross-feature, 5-Volume, Security, Data Display, UI Fixes, Categories Taxonomy)</w:t>
             </w:r>
           </w:p>
         </w:tc>
@@ -2546,36 +2323,16 @@
             <w:shd w:fill="fff3e0" w:val="clear"/>
           </w:tcPr>
           <w:p>
-            <w:pPr>
-              <w:rPr/>
-            </w:pPr>
-            <w:r>
-              <w:rPr>
-                <w:b w:val="1"/>
-                <w:bCs w:val="1"/>
-                <w:color w:val="dd8800"/>
-                <w:rtl w:val="0"/>
-              </w:rPr>
-              <w:t xml:space="preserve">Pending</w:t>
-            </w:r>
-            <w:r>
-              <w:rPr>
-                <w:rtl w:val="0"/>
-              </w:rPr>
-            </w:r>
-          </w:p>
-        </w:tc>
-        <w:tc>
-          <w:tcPr/>
-          <w:p>
-            <w:pPr>
-              <w:rPr/>
-            </w:pPr>
-            <w:r>
-              <w:rPr>
-                <w:rtl w:val="0"/>
-              </w:rPr>
-              <w:t xml:space="preserve">Will be shared post final demo</w:t>
+            <w:r>
+              <w:t>Done</w:t>
+            </w:r>
+          </w:p>
+        </w:tc>
+        <w:tc>
+          <w:tcPr/>
+          <w:p>
+            <w:r>
+              <w:t>9 project documents (ADR, Cost Analysis, Data Preprocessing, Embedding Analysis, Gemini Setup, LLM Migration, LLM Analysis, OCR Analysis, Status Report). system_architecture.md, README.md, CLAUDE.md all current.</w:t>
             </w:r>
           </w:p>
         </w:tc>
@@ -3152,6 +2909,182 @@
                 <w:rtl w:val="0"/>
               </w:rPr>
               <w:t xml:space="preserve">All 106 issues mapped to Google Drive URLs with embeddable preview</w:t>
+            </w:r>
+          </w:p>
+        </w:tc>
+      </w:tr>
+      <w:tr>
+        <w:tc>
+          <w:tcPr>
+            <w:tcW w:type="dxa" w:w="5240"/>
+          </w:tcPr>
+          <w:p>
+            <w:r>
+              <w:t>Prompt Guardrails</w:t>
+            </w:r>
+          </w:p>
+        </w:tc>
+        <w:tc>
+          <w:tcPr>
+            <w:tcW w:type="dxa" w:w="5240"/>
+          </w:tcPr>
+          <w:p>
+            <w:r>
+              <w:t>guardrails.py — 4-layer defense: input sanitization (quote/control char stripping, NFC normalize), injection detection (HIGH: block, MEDIUM: warn), history validation (alternating roles, 5K char limit), output leakage prevention (API keys, config, model names)</w:t>
+            </w:r>
+          </w:p>
+        </w:tc>
+      </w:tr>
+      <w:tr>
+        <w:tc>
+          <w:tcPr>
+            <w:tcW w:type="dxa" w:w="5240"/>
+          </w:tcPr>
+          <w:p>
+            <w:r>
+              <w:t>Article Tagging System</w:t>
+            </w:r>
+          </w:p>
+        </w:tc>
+        <w:tc>
+          <w:tcPr>
+            <w:tcW w:type="dxa" w:w="5240"/>
+          </w:tcPr>
+          <w:p>
+            <w:r>
+              <w:t>15-category taxonomy with hybrid NLP tagger (rule-based + TF-IDF). Fully offline, deterministic. Tags stored in Qdrant payload + summary.csv. TagBrowse UI + /api/tags endpoints.</w:t>
+            </w:r>
+          </w:p>
+        </w:tc>
+      </w:tr>
+      <w:tr>
+        <w:tc>
+          <w:tcPr>
+            <w:tcW w:type="dxa" w:w="5240"/>
+          </w:tcPr>
+          <w:p>
+            <w:r>
+              <w:t>Magazine Registry</w:t>
+            </w:r>
+          </w:p>
+        </w:tc>
+        <w:tc>
+          <w:tcPr>
+            <w:tcW w:type="dxa" w:w="5240"/>
+          </w:tcPr>
+          <w:p>
+            <w:r>
+              <w:t>config/magazine_registry.json — single source of truth for all volumes, issues, PDF links, S3 paths. Adding issues requires editing only this file. Replaced hardcoded pdf_links.py and volumeImages.js.</w:t>
+            </w:r>
+          </w:p>
+        </w:tc>
+      </w:tr>
+      <w:tr>
+        <w:tc>
+          <w:tcPr>
+            <w:tcW w:type="dxa" w:w="5240"/>
+          </w:tcPr>
+          <w:p>
+            <w:r>
+              <w:t>S3 Image Proxy</w:t>
+            </w:r>
+          </w:p>
+        </w:tc>
+        <w:tc>
+          <w:tcPr>
+            <w:tcW w:type="dxa" w:w="5240"/>
+          </w:tcPr>
+          <w:p>
+            <w:r>
+              <w:t>Cover images served via /api/images/volumes/{id}/cover. No presigned URLs — proxy never expires. 1-hour browser cache. .png/.jpg fallback.</w:t>
+            </w:r>
+          </w:p>
+        </w:tc>
+      </w:tr>
+      <w:tr>
+        <w:tc>
+          <w:tcPr>
+            <w:tcW w:type="dxa" w:w="5240"/>
+          </w:tcPr>
+          <w:p>
+            <w:r>
+              <w:t>Multi-Turn Conversation</w:t>
+            </w:r>
+          </w:p>
+        </w:tc>
+        <w:tc>
+          <w:tcPr>
+            <w:tcW w:type="dxa" w:w="5240"/>
+          </w:tcPr>
+          <w:p>
+            <w:r>
+              <w:t>Last 3 Q&amp;A turns sent as history. Backend validates via guardrails. Cache skipped when history present.</w:t>
+            </w:r>
+          </w:p>
+        </w:tc>
+      </w:tr>
+      <w:tr>
+        <w:tc>
+          <w:tcPr>
+            <w:tcW w:type="dxa" w:w="5240"/>
+          </w:tcPr>
+          <w:p>
+            <w:r>
+              <w:t>Retry Utilities</w:t>
+            </w:r>
+          </w:p>
+        </w:tc>
+        <w:tc>
+          <w:tcPr>
+            <w:tcW w:type="dxa" w:w="5240"/>
+          </w:tcPr>
+          <w:p>
+            <w:r>
+              <w:t>retry.py — exponential backoff with jitter for Qdrant/Gemini. Sync + async retry loops with service-specific transient error detection.</w:t>
+            </w:r>
+          </w:p>
+        </w:tc>
+      </w:tr>
+      <w:tr>
+        <w:tc>
+          <w:tcPr>
+            <w:tcW w:type="dxa" w:w="5240"/>
+          </w:tcPr>
+          <w:p>
+            <w:r>
+              <w:t>Snapshot Manager</w:t>
+            </w:r>
+          </w:p>
+        </w:tc>
+        <w:tc>
+          <w:tcPr>
+            <w:tcW w:type="dxa" w:w="5240"/>
+          </w:tcPr>
+          <w:p>
+            <w:r>
+              <w:t>snapshot_manager.py — Qdrant index backup/restore via S3. Reindex detection using embedding fingerprint + source data hash.</w:t>
+            </w:r>
+          </w:p>
+        </w:tc>
+      </w:tr>
+      <w:tr>
+        <w:tc>
+          <w:tcPr>
+            <w:tcW w:type="dxa" w:w="5240"/>
+          </w:tcPr>
+          <w:p>
+            <w:r>
+              <w:t>Gemini 2.5 Flash Migration</w:t>
+            </w:r>
+          </w:p>
+        </w:tc>
+        <w:tc>
+          <w:tcPr>
+            <w:tcW w:type="dxa" w:w="5240"/>
+          </w:tcPr>
+          <w:p>
+            <w:r>
+              <w:t>Replaced self-hosted Ollama/Tamil-LLaMA 7B with Gemini 2.5 Flash API. Response time: 15–20s → 2–5s. Infrastructure cost: $120–386/mo → ~$0. Dual-prompt system: CSV gist + vector document prompts.</w:t>
             </w:r>
           </w:p>
         </w:tc>
@@ -3300,14 +3233,8 @@
         <w:tc>
           <w:tcPr/>
           <w:p>
-            <w:pPr>
-              <w:rPr/>
-            </w:pPr>
-            <w:r>
-              <w:rPr>
-                <w:rtl w:val="0"/>
-              </w:rPr>
-              <w:t xml:space="preserve">3 remaining volumes OCR data</w:t>
+            <w:r>
+              <w:t>Missing issues (not indexed)</w:t>
             </w:r>
           </w:p>
         </w:tc>
@@ -3316,56 +3243,30 @@
             <w:shd w:fill="fff3e0" w:val="clear"/>
           </w:tcPr>
           <w:p>
-            <w:pPr>
-              <w:rPr/>
-            </w:pPr>
-            <w:r>
-              <w:rPr>
-                <w:b w:val="1"/>
-                <w:bCs w:val="1"/>
-                <w:color w:val="dd8800"/>
-                <w:rtl w:val="0"/>
-              </w:rPr>
-              <w:t xml:space="preserve">Blocked</w:t>
-            </w:r>
-            <w:r>
-              <w:rPr>
-                <w:rtl w:val="0"/>
-              </w:rPr>
-            </w:r>
-          </w:p>
-        </w:tc>
-        <w:tc>
-          <w:tcPr/>
-          <w:p>
-            <w:pPr>
-              <w:rPr/>
-            </w:pPr>
-            <w:r>
-              <w:rPr>
-                <w:rtl w:val="0"/>
-              </w:rPr>
-              <w:t xml:space="preserve">Awaiting data from DCKAP / MCC</w:t>
-            </w:r>
-          </w:p>
-        </w:tc>
-      </w:tr>
-      <w:tr>
-        <w:trPr>
-          <w:cantSplit w:val="0"/>
-          <w:tblHeader w:val="0"/>
-        </w:trPr>
-        <w:tc>
-          <w:tcPr/>
-          <w:p>
-            <w:pPr>
-              <w:rPr/>
-            </w:pPr>
-            <w:r>
-              <w:rPr>
-                <w:rtl w:val="0"/>
-              </w:rPr>
-              <w:t xml:space="preserve">Article tagging system</w:t>
+            <w:r>
+              <w:t>Blocked</w:t>
+            </w:r>
+          </w:p>
+        </w:tc>
+        <w:tc>
+          <w:tcPr/>
+          <w:p>
+            <w:r>
+              <w:t>Vol 4: Issues 2, 3, 6, 8, 9 (proofread docs not provided). Vol 6: Issues 1–7, 9–14, 19–21, Pongal (proofread available but not indexed). Vol 7: All issues (no proofread docs provided). Vol 8: All 10 issues (proofread available for issues 6, 7, 12 but not indexed). Vol 3: Issue 20 (proofread doc not available).</w:t>
+            </w:r>
+          </w:p>
+        </w:tc>
+      </w:tr>
+      <w:tr>
+        <w:trPr>
+          <w:cantSplit w:val="0"/>
+          <w:tblHeader w:val="0"/>
+        </w:trPr>
+        <w:tc>
+          <w:tcPr/>
+          <w:p>
+            <w:r>
+              <w:t>UAT with students</w:t>
             </w:r>
           </w:p>
         </w:tc>
@@ -3374,152 +3275,16 @@
             <w:shd w:fill="ffebee" w:val="clear"/>
           </w:tcPr>
           <w:p>
-            <w:pPr>
-              <w:rPr/>
-            </w:pPr>
-            <w:r>
-              <w:rPr>
-                <w:b w:val="1"/>
-                <w:bCs w:val="1"/>
-                <w:color w:val="cc0000"/>
-                <w:rtl w:val="0"/>
-              </w:rPr>
-              <w:t xml:space="preserve">Not a priority</w:t>
-            </w:r>
-            <w:r>
-              <w:rPr>
-                <w:rtl w:val="0"/>
-              </w:rPr>
-            </w:r>
-          </w:p>
-        </w:tc>
-        <w:tc>
-          <w:tcPr/>
-          <w:p>
-            <w:pPr>
-              <w:rPr/>
-            </w:pPr>
-            <w:r>
-              <w:rPr>
-                <w:rtl w:val="0"/>
-              </w:rPr>
-              <w:t xml:space="preserve">SoW Phase 4 deliverable; needs tag taxonomy design</w:t>
-            </w:r>
-          </w:p>
-        </w:tc>
-      </w:tr>
-      <w:tr>
-        <w:trPr>
-          <w:cantSplit w:val="0"/>
-          <w:tblHeader w:val="0"/>
-        </w:trPr>
-        <w:tc>
-          <w:tcPr/>
-          <w:p>
-            <w:pPr>
-              <w:rPr/>
-            </w:pPr>
-            <w:r>
-              <w:rPr>
-                <w:rtl w:val="0"/>
-              </w:rPr>
-              <w:t xml:space="preserve">Tag-based filtering UI</w:t>
-            </w:r>
-          </w:p>
-        </w:tc>
-        <w:tc>
-          <w:tcPr>
-            <w:shd w:fill="ffebee" w:val="clear"/>
-          </w:tcPr>
-          <w:p>
-            <w:pPr>
-              <w:rPr/>
-            </w:pPr>
-            <w:r>
-              <w:rPr>
-                <w:b w:val="1"/>
-                <w:bCs w:val="1"/>
-                <w:color w:val="cc0000"/>
-                <w:rtl w:val="0"/>
-              </w:rPr>
-              <w:t xml:space="preserve">Not a priority</w:t>
-            </w:r>
-            <w:r>
-              <w:rPr>
-                <w:rtl w:val="0"/>
-              </w:rPr>
-            </w:r>
-          </w:p>
-        </w:tc>
-        <w:tc>
-          <w:tcPr/>
-          <w:p>
-            <w:pPr>
-              <w:rPr/>
-            </w:pPr>
-            <w:r>
-              <w:rPr>
-                <w:rtl w:val="0"/>
-              </w:rPr>
-              <w:t xml:space="preserve">Depends on tagging system</w:t>
-            </w:r>
-          </w:p>
-        </w:tc>
-      </w:tr>
-      <w:tr>
-        <w:trPr>
-          <w:cantSplit w:val="0"/>
-          <w:tblHeader w:val="0"/>
-        </w:trPr>
-        <w:tc>
-          <w:tcPr/>
-          <w:p>
-            <w:pPr>
-              <w:rPr/>
-            </w:pPr>
-            <w:r>
-              <w:rPr>
-                <w:rtl w:val="0"/>
-              </w:rPr>
-              <w:t xml:space="preserve">Evaluation with ground truth</w:t>
-            </w:r>
-          </w:p>
-        </w:tc>
-        <w:tc>
-          <w:tcPr>
-            <w:shd w:fill="ffebee" w:val="clear"/>
-          </w:tcPr>
-          <w:p>
-            <w:pPr>
-              <w:rPr/>
-            </w:pPr>
-            <w:r>
-              <w:rPr>
-                <w:b w:val="1"/>
-                <w:bCs w:val="1"/>
-                <w:color w:val="cc0000"/>
-                <w:rtl w:val="0"/>
-              </w:rPr>
-              <w:t xml:space="preserve">Not started</w:t>
-            </w:r>
-            <w:r>
-              <w:rPr>
-                <w:rtl w:val="0"/>
-              </w:rPr>
-            </w:r>
-          </w:p>
-        </w:tc>
-        <w:tc>
-          <w:tcPr/>
-          <w:p>
-            <w:pPr>
-              <w:rPr/>
-            </w:pPr>
-            <w:r>
-              <w:rPr>
-                <w:rtl w:val="0"/>
-              </w:rPr>
-              <w:t xml:space="preserve">Students will fill 30-question CSV template</w:t>
+            <w:r>
+              <w:t>In Progress</w:t>
+            </w:r>
+          </w:p>
+        </w:tc>
+        <w:tc>
+          <w:tcPr/>
+          <w:p>
+            <w:r>
+              <w:t>156 UAT test cases prepared. Awaiting student testers.</w:t>
             </w:r>
           </w:p>
         </w:tc>
@@ -3826,28 +3591,16 @@
         <w:tc>
           <w:tcPr/>
           <w:p>
-            <w:pPr>
-              <w:rPr/>
-            </w:pPr>
-            <w:r>
-              <w:rPr>
-                <w:rtl w:val="0"/>
-              </w:rPr>
-              <w:t xml:space="preserve">LLM</w:t>
-            </w:r>
-          </w:p>
-        </w:tc>
-        <w:tc>
-          <w:tcPr/>
-          <w:p>
-            <w:pPr>
-              <w:rPr/>
-            </w:pPr>
-            <w:r>
-              <w:rPr>
-                <w:rtl w:val="0"/>
-              </w:rPr>
-              <w:t xml:space="preserve">Tamil LLaMA 7B v0.1 via Ollama (4K native ctx, 8K extended)</w:t>
+            <w:r>
+              <w:t>LLM</w:t>
+            </w:r>
+          </w:p>
+        </w:tc>
+        <w:tc>
+          <w:tcPr/>
+          <w:p>
+            <w:r>
+              <w:t>Google Gemini 2.5 Flash API (google-genai SDK). Replaced Tamil LLaMA/Ollama.</w:t>
             </w:r>
           </w:p>
         </w:tc>
@@ -3874,14 +3627,8 @@
         <w:tc>
           <w:tcPr/>
           <w:p>
-            <w:pPr>
-              <w:rPr/>
-            </w:pPr>
-            <w:r>
-              <w:rPr>
-                <w:rtl w:val="0"/>
-              </w:rPr>
-              <w:t xml:space="preserve">FastAPI (Python 3.9+) — 14 endpoints, async, SSE streaming</w:t>
+            <w:r>
+              <w:t>FastAPI (Python 3.10+) — 20+ endpoints, async, SSE streaming, S3 image proxy</w:t>
             </w:r>
           </w:p>
         </w:tc>
@@ -3976,14 +3723,8 @@
         <w:tc>
           <w:tcPr/>
           <w:p>
-            <w:pPr>
-              <w:rPr/>
-            </w:pPr>
-            <w:r>
-              <w:rPr>
-                <w:rtl w:val="0"/>
-              </w:rPr>
-              <w:t xml:space="preserve">Docker Compose — 4 containers + GPU support for Ollama</w:t>
+            <w:r>
+              <w:t>Docker Compose — 3 containers (Qdrant, FastAPI, React/Nginx). No GPU required.</w:t>
             </w:r>
           </w:p>
         </w:tc>
@@ -4010,14 +3751,8 @@
         <w:tc>
           <w:tcPr/>
           <w:p>
-            <w:pPr>
-              <w:rPr/>
-            </w:pPr>
-            <w:r>
-              <w:rPr>
-                <w:rtl w:val="0"/>
-              </w:rPr>
-              <w:t xml:space="preserve">1,665 articles | 8 volumes (1947–1955) | 106 issues | 200+ authors</w:t>
+            <w:r>
+              <w:t>1,692 articles | 8 volumes (1947–1955) | 108 issues in registry | 73 issues indexed (Vols 1–5 complete, Vol 3 missing issue 20, Vol 4 partial) | 200+ authors | 15 article categories</w:t>
             </w:r>
           </w:p>
         </w:tc>
@@ -4205,6 +3940,148 @@
       <w:sz w:val="52"/>
       <w:szCs w:val="52"/>
     </w:rPr>
+  </w:style>
+  <w:style w:type="table" w:styleId="TableNormal" w:default="1">
+    <w:name w:val="TableNormal"/>
+    <w:tblPr>
+      <w:tblCellMar>
+        <w:top w:w="100.0" w:type="dxa"/>
+        <w:left w:w="100.0" w:type="dxa"/>
+        <w:bottom w:w="100.0" w:type="dxa"/>
+        <w:right w:w="100.0" w:type="dxa"/>
+      </w:tblCellMar>
+    </w:tblPr>
+  </w:style>
+  <w:style w:type="paragraph" w:styleId="Normal" w:default="1">
+    <w:name w:val="normal"/>
+  </w:style>
+  <w:style w:type="table" w:styleId="Table1">
+    <w:basedOn w:val="TableNormal"/>
+    <w:pPr>
+      <w:spacing w:after="0" w:line="240" w:lineRule="auto"/>
+    </w:pPr>
+    <w:tblPr>
+      <w:tblStyleRowBandSize w:val="1"/>
+      <w:tblStyleColBandSize w:val="1"/>
+      <w:tblCellMar>
+        <w:top w:w="0.0" w:type="dxa"/>
+        <w:left w:w="108.0" w:type="dxa"/>
+        <w:bottom w:w="0.0" w:type="dxa"/>
+        <w:right w:w="108.0" w:type="dxa"/>
+      </w:tblCellMar>
+    </w:tblPr>
+  </w:style>
+  <w:style w:type="table" w:styleId="Table2">
+    <w:basedOn w:val="TableNormal"/>
+    <w:pPr>
+      <w:spacing w:after="0" w:line="240" w:lineRule="auto"/>
+    </w:pPr>
+    <w:tblPr>
+      <w:tblStyleRowBandSize w:val="1"/>
+      <w:tblStyleColBandSize w:val="1"/>
+      <w:tblCellMar>
+        <w:top w:w="0.0" w:type="dxa"/>
+        <w:left w:w="108.0" w:type="dxa"/>
+        <w:bottom w:w="0.0" w:type="dxa"/>
+        <w:right w:w="108.0" w:type="dxa"/>
+      </w:tblCellMar>
+    </w:tblPr>
+  </w:style>
+  <w:style w:type="table" w:styleId="Table3">
+    <w:basedOn w:val="TableNormal"/>
+    <w:pPr>
+      <w:spacing w:after="0" w:line="240" w:lineRule="auto"/>
+    </w:pPr>
+    <w:tblPr>
+      <w:tblStyleRowBandSize w:val="1"/>
+      <w:tblStyleColBandSize w:val="1"/>
+      <w:tblCellMar>
+        <w:top w:w="0.0" w:type="dxa"/>
+        <w:left w:w="108.0" w:type="dxa"/>
+        <w:bottom w:w="0.0" w:type="dxa"/>
+        <w:right w:w="108.0" w:type="dxa"/>
+      </w:tblCellMar>
+    </w:tblPr>
+  </w:style>
+  <w:style w:type="table" w:styleId="Table4">
+    <w:basedOn w:val="TableNormal"/>
+    <w:pPr>
+      <w:spacing w:after="0" w:line="240" w:lineRule="auto"/>
+    </w:pPr>
+    <w:tblPr>
+      <w:tblStyleRowBandSize w:val="1"/>
+      <w:tblStyleColBandSize w:val="1"/>
+      <w:tblCellMar>
+        <w:top w:w="0.0" w:type="dxa"/>
+        <w:left w:w="108.0" w:type="dxa"/>
+        <w:bottom w:w="0.0" w:type="dxa"/>
+        <w:right w:w="108.0" w:type="dxa"/>
+      </w:tblCellMar>
+    </w:tblPr>
+  </w:style>
+  <w:style w:type="table" w:styleId="Table5">
+    <w:basedOn w:val="TableNormal"/>
+    <w:pPr>
+      <w:spacing w:after="0" w:line="240" w:lineRule="auto"/>
+    </w:pPr>
+    <w:tblPr>
+      <w:tblStyleRowBandSize w:val="1"/>
+      <w:tblStyleColBandSize w:val="1"/>
+      <w:tblCellMar>
+        <w:top w:w="0.0" w:type="dxa"/>
+        <w:left w:w="108.0" w:type="dxa"/>
+        <w:bottom w:w="0.0" w:type="dxa"/>
+        <w:right w:w="108.0" w:type="dxa"/>
+      </w:tblCellMar>
+    </w:tblPr>
+  </w:style>
+  <w:style w:type="table" w:styleId="Table6">
+    <w:basedOn w:val="TableNormal"/>
+    <w:pPr>
+      <w:spacing w:after="0" w:line="240" w:lineRule="auto"/>
+    </w:pPr>
+    <w:tblPr>
+      <w:tblStyleRowBandSize w:val="1"/>
+      <w:tblStyleColBandSize w:val="1"/>
+      <w:tblCellMar>
+        <w:top w:w="0.0" w:type="dxa"/>
+        <w:left w:w="108.0" w:type="dxa"/>
+        <w:bottom w:w="0.0" w:type="dxa"/>
+        <w:right w:w="108.0" w:type="dxa"/>
+      </w:tblCellMar>
+    </w:tblPr>
+  </w:style>
+  <w:style w:type="table" w:styleId="Table7">
+    <w:basedOn w:val="TableNormal"/>
+    <w:pPr>
+      <w:spacing w:after="0" w:line="240" w:lineRule="auto"/>
+    </w:pPr>
+    <w:tblPr>
+      <w:tblStyleRowBandSize w:val="1"/>
+      <w:tblStyleColBandSize w:val="1"/>
+      <w:tblCellMar>
+        <w:top w:w="0.0" w:type="dxa"/>
+        <w:left w:w="108.0" w:type="dxa"/>
+        <w:bottom w:w="0.0" w:type="dxa"/>
+        <w:right w:w="108.0" w:type="dxa"/>
+      </w:tblCellMar>
+    </w:tblPr>
+  </w:style>
+  <w:style w:type="table" w:styleId="Table8">
+    <w:basedOn w:val="TableNormal"/>
+    <w:pPr>
+      <w:spacing w:after="0" w:line="240" w:lineRule="auto"/>
+    </w:pPr>
+    <w:tblPr>
+      <w:tblStyleRowBandSize w:val="1"/>
+      <w:tblStyleColBandSize w:val="1"/>
+      <w:tblCellMar>
+        <w:top w:w="0.0" w:type="dxa"/>
+        <w:left w:w="108.0" w:type="dxa"/>
+        <w:bottom w:w="0.0" w:type="dxa"/>
+        <w:right w:w="108.0" w:type="dxa"/>
+      </w:tblCellMar>
+    </w:tblPr>
   </w:style>
   <w:style w:type="paragraph" w:styleId="Subtitle">
     <w:name w:val="Subtitle"/>
@@ -4674,4 +4551,19 @@
   </a:objectDefaults>
   <a:extraClrSchemeLst/>
 </a:theme>
+</file>
+
+<file path=customXML/item1.xml><?xml version="1.0" encoding="utf-8"?>
+<go:gDocsCustomXmlDataStorage xmlns:go="http://customooxmlschemas.google.com/" xmlns:r="http://schemas.openxmlformats.org/officeDocument/2006/relationships" uri="GoogleDocsCustomDataVersion2">
+  <go:docsCustomData xmlns:go="http://customooxmlschemas.google.com/" roundtripDataSignature="AMtx7miBgolujduJgL6umhHY64kfSSvBag==">CgMxLjAaDQoBMBIICgYIBTICCAEyDmguN3Z1M3R0ZzJoc2hvOAByITFIQzY2X29YQzBBbGEyQmFJVzJMMm1aUGtBcWx2Wmh3ZA==</go:docsCustomData>
+</go:gDocsCustomXmlDataStorage>
+</file>
+
+<file path=customXML/itemProps1.xml><?xml version="1.0" encoding="utf-8"?>
+<ds:datastoreItem xmlns:ds="http://schemas.openxmlformats.org/officeDocument/2006/customXml" ds:itemID="{11111111-1234-1234-1234-123412341234}">
+  <ds:schemaRefs>
+    <ds:schemaRef ds:uri="http://schemas.openxmlformats.org/officeDocument/2006/relationships"/>
+    <ds:schemaRef ds:uri="http://customooxmlschemas.google.com/"/>
+  </ds:schemaRefs>
+</ds:datastoreItem>
 </file>
</xml_diff>